<commit_message>
feat: school-first evaluator workflow, staff roles, basic school creation by admin, and searchable evaluator filter
</commit_message>
<xml_diff>
--- a/فرم ارزیاب معلم (1).docx
+++ b/فرم ارزیاب معلم (1).docx
@@ -2439,7 +2439,7 @@
         <w:bidi/>
         <w:spacing w:line="240" w:lineRule="auto"/>
         <w:rPr>
-          <w:rFonts w:cs="B Zar" w:hint="cs"/>
+          <w:rFonts w:cs="B Zar"/>
           <w:rtl/>
           <w:lang w:bidi="fa-IR"/>
         </w:rPr>
@@ -3446,7 +3446,6 @@
           <w:rFonts w:cs="B Zar"/>
           <w:b/>
           <w:bCs/>
-          <w:rtl/>
           <w:lang w:bidi="fa-IR"/>
         </w:rPr>
       </w:pPr>
@@ -3457,6 +3456,95 @@
         <w:spacing w:line="240" w:lineRule="auto"/>
         <w:rPr>
           <w:rFonts w:cs="B Zar"/>
+          <w:rtl/>
+          <w:lang w:bidi="fa-IR"/>
+        </w:rPr>
+      </w:pPr>
+      <w:r>
+        <w:rPr>
+          <w:rFonts w:cs="B Zar" w:hint="cs"/>
+          <w:rtl/>
+          <w:lang w:bidi="fa-IR"/>
+        </w:rPr>
+        <w:t>نظر ارزیاب :</w:t>
+      </w:r>
+    </w:p>
+    <w:p>
+      <w:pPr>
+        <w:bidi/>
+        <w:spacing w:line="240" w:lineRule="auto"/>
+        <w:rPr>
+          <w:rFonts w:cs="B Zar"/>
+          <w:rtl/>
+        </w:rPr>
+      </w:pPr>
+      <w:r>
+        <w:rPr>
+          <w:rFonts w:cs="B Zar"/>
+          <w:rtl/>
+        </w:rPr>
+        <w:t>توانمند در شناسایی و هدایت استعداددارای ظرفیت مناسب،</w:t>
+      </w:r>
+    </w:p>
+    <w:p>
+      <w:pPr>
+        <w:bidi/>
+        <w:spacing w:line="240" w:lineRule="auto"/>
+        <w:rPr>
+          <w:rFonts w:cs="B Zar"/>
+          <w:rtl/>
+        </w:rPr>
+      </w:pPr>
+      <w:r>
+        <w:rPr>
+          <w:rFonts w:cs="B Zar"/>
+          <w:rtl/>
+        </w:rPr>
+        <w:lastRenderedPageBreak/>
+        <w:t xml:space="preserve"> نیازمند توانمندسازیبیشتر </w:t>
+      </w:r>
+    </w:p>
+    <w:p>
+      <w:pPr>
+        <w:bidi/>
+        <w:spacing w:line="240" w:lineRule="auto"/>
+        <w:rPr>
+          <w:rFonts w:cs="B Zar"/>
+          <w:rtl/>
+        </w:rPr>
+      </w:pPr>
+      <w:r>
+        <w:rPr>
+          <w:rFonts w:cs="B Zar"/>
+          <w:rtl/>
+        </w:rPr>
+        <w:t>مناسب معرفی موردی دانش‌آموز</w:t>
+      </w:r>
+    </w:p>
+    <w:p>
+      <w:pPr>
+        <w:bidi/>
+        <w:spacing w:line="240" w:lineRule="auto"/>
+        <w:rPr>
+          <w:rFonts w:cs="B Zar" w:hint="cs"/>
+          <w:rtl/>
+          <w:lang w:bidi="fa-IR"/>
+        </w:rPr>
+      </w:pPr>
+      <w:r>
+        <w:rPr>
+          <w:rFonts w:cs="B Zar"/>
+          <w:rtl/>
+        </w:rPr>
+        <w:t>فاقد توان کافی برای هدایت استعداد</w:t>
+      </w:r>
+    </w:p>
+    <w:p>
+      <w:pPr>
+        <w:bidi/>
+        <w:spacing w:line="240" w:lineRule="auto"/>
+        <w:rPr>
+          <w:rFonts w:cs="B Zar"/>
           <w:b/>
           <w:bCs/>
           <w:rtl/>
@@ -3497,7 +3585,6 @@
           <w:rtl/>
           <w:lang w:bidi="fa-IR"/>
         </w:rPr>
-        <w:lastRenderedPageBreak/>
         <w:t>3</w:t>
       </w:r>
       <w:r>
@@ -5351,6 +5438,7 @@
           <w:rtl/>
           <w:lang w:bidi="fa-IR"/>
         </w:rPr>
+        <w:lastRenderedPageBreak/>
         <w:t>فاقد</w:t>
       </w:r>
       <w:r>
@@ -5470,7 +5558,6 @@
           <w:rtl/>
           <w:lang w:bidi="fa-IR"/>
         </w:rPr>
-        <w:lastRenderedPageBreak/>
         <w:t xml:space="preserve">5. </w:t>
       </w:r>
       <w:r>
@@ -6997,6 +7084,7 @@
                 <w:rtl/>
                 <w:lang w:bidi="fa-IR"/>
               </w:rPr>
+              <w:lastRenderedPageBreak/>
               <w:t>کد</w:t>
             </w:r>
             <w:r>
@@ -7261,7 +7349,6 @@
           <w:rtl/>
           <w:lang w:bidi="fa-IR"/>
         </w:rPr>
-        <w:lastRenderedPageBreak/>
         <w:t>دولت</w:t>
       </w:r>
       <w:r>
@@ -8521,7 +8608,6 @@
           <w:rtl/>
           <w:lang w:bidi="fa-IR"/>
         </w:rPr>
-        <w:lastRenderedPageBreak/>
         <w:t>مهارت‌محور</w:t>
       </w:r>
     </w:p>
@@ -9416,6 +9502,7 @@
           <w:rtl/>
           <w:lang w:bidi="fa-IR"/>
         </w:rPr>
+        <w:lastRenderedPageBreak/>
         <w:t>روزنامه‌نگار</w:t>
       </w:r>
       <w:r>
@@ -9695,7 +9782,6 @@
           <w:rtl/>
           <w:lang w:bidi="fa-IR"/>
         </w:rPr>
-        <w:lastRenderedPageBreak/>
         <w:t>بازد</w:t>
       </w:r>
       <w:r>
@@ -11127,7 +11213,6 @@
   <w:style w:type="character" w:default="1" w:styleId="DefaultParagraphFont">
     <w:name w:val="Default Paragraph Font"/>
     <w:uiPriority w:val="1"/>
-    <w:semiHidden/>
     <w:unhideWhenUsed/>
   </w:style>
   <w:style w:type="table" w:default="1" w:styleId="TableNormal">

</xml_diff>